<commit_message>
Registro art.30 v1.2: fornitore hosting IONOS identificato, base art.28 e data center UE
</commit_message>
<xml_diff>
--- a/legal/Registro_Trattamenti_Art30_IT.docx
+++ b/legal/Registro_Trattamenti_Art30_IT.docx
@@ -42,7 +42,7 @@
           <w:sz w:val="20"/>
           <w:szCs w:val="20"/>
         </w:rPr>
-        <w:t>Ultimo aggiornamento: 21 settembre 2026 · Versione 1.1</w:t>
+        <w:t>Ultimo aggiornamento: 22 settembre 2026 · Versione 1.2</w:t>
       </w:r>
     </w:p>
     <w:p>
@@ -518,7 +518,7 @@
                 <w:sz w:val="19"/>
                 <w:szCs w:val="19"/>
               </w:rPr>
-              <w:t>Provider hosting (IONOS); provider email transazionale; personale interno autorizzato.</w:t>
+              <w:t>Provider hosting: IONOS SE — prodotto «IONOS VPS Linux L+», contratto n. 112969652, attivo dal 14/07/2026, server ospitato nel data center di Berlino (Germania). L'accordo sul trattamento dei dati ex art. 28 GDPR è parte integrante delle Condizioni generali di contratto IONOS per i contratti stipulati dal 19/07/2022, quindi non è richiesto un accordo separato (copia delle condizioni archiviata in legal/). Provider email transazionale; personale interno autorizzato.</w:t>
             </w:r>
           </w:p>
         </w:tc>
@@ -570,7 +570,7 @@
                 <w:sz w:val="19"/>
                 <w:szCs w:val="19"/>
               </w:rPr>
-              <w:t xml:space="preserve">Nessuno sistematico. Eventuali servizi US via DPF/SCC.</w:t>
+              <w:t>Nessuno sistematico. L'infrastruttura di hosting è interamente nell'Unione Europea (Berlino, Germania). Eventuali servizi statunitensi via DPF/SCC.</w:t>
             </w:r>
           </w:p>
         </w:tc>
@@ -3387,7 +3387,7 @@
         <w:jc w:val="both"/>
       </w:pPr>
       <w:r>
-        <w:t>Versione 1.1 — 21 settembre 2026. Aggiornate le misure di sicurezza di T1, T2 e T3 e i trasferimenti di T2 a seguito dell'introduzione in produzione della separazione strutturale delle identità e della de-identificazione dei prompt IA su tutti i percorsi automatici. Corretto il nominativo del provider hosting in T1 (IONOS).</w:t>
+        <w:t>Versione 1.2 — 22 settembre 2026. Identificato con precisione il fornitore hosting (IONOS VPS Linux L+, contratto 112969652, data center Berlino) e la base dell'accordo art. 28. Versione 1.1 del 21 settembre 2026: aggiornate le misure di sicurezza di T1, T2 e T3 dopo l'introduzione in produzione della separazione strutturale delle identità e della de-identificazione dei prompt IA su tutti i percorsi automatici.</w:t>
       </w:r>
     </w:p>
     <w:sectPr>

</xml_diff>